<commit_message>
Add public repository link to manuscript
</commit_message>
<xml_diff>
--- a/Spill_Monitoring_Framework_Manuscript_Draft.docx
+++ b/Spill_Monitoring_Framework_Manuscript_Draft.docx
@@ -1507,6 +1507,32 @@
         <w:pStyle w:val="Heading1"/>
       </w:pPr>
       <w:r>
+        <w:t>Data and code availability</w:t>
+      </w:r>
+    </w:p>
+    <w:p>
+      <w:pPr/>
+      <w:r>
+        <w:t xml:space="preserve">The public research package, including the trained YOLO detector and conservation PINN, the detector splits and synthetic PINN trajectories, training and evaluation scripts, selected results, and this manuscript draft, is available at </w:t>
+      </w:r>
+      <w:hyperlink r:id="rId19">
+        <w:r>
+          <w:rPr>
+            <w:color w:val="0563C1"/>
+            <w:u w:val="single"/>
+          </w:rPr>
+          <w:t>https://github.com/jeanson55/spill-monitoring-framework-manuscript</w:t>
+        </w:r>
+      </w:hyperlink>
+      <w:r>
+        <w:t>. The detector-data attribution and license information are provided in the repository.</w:t>
+      </w:r>
+    </w:p>
+    <w:p>
+      <w:pPr>
+        <w:pStyle w:val="Heading1"/>
+      </w:pPr>
+      <w:r>
         <w:t>References</w:t>
       </w:r>
     </w:p>

</xml_diff>